<commit_message>
Auto-save: 21 file(s) — 2026-10-01 10:52
</commit_message>
<xml_diff>
--- a/Notes/2026-10-01-xsecurity-nav-nepra-ot-security-brief-v1.0.docx
+++ b/Notes/2026-10-01-xsecurity-nav-nepra-ot-security-brief-v1.0.docx
@@ -290,6 +290,7 @@
       </w:tblGrid>
       <w:tr>
         <w:trPr>
+          <w:cantSplit/>
           <w:tblHeader/>
         </w:trPr>
         <w:tc>
@@ -351,6 +352,7 @@
       </w:tr>
       <w:tr>
         <w:trPr>
+          <w:cantSplit/>
           <w:tblHeader w:val="off"/>
         </w:trPr>
         <w:tc>
@@ -404,6 +406,7 @@
       </w:tr>
       <w:tr>
         <w:trPr>
+          <w:cantSplit/>
           <w:tblHeader w:val="off"/>
         </w:trPr>
         <w:tc>
@@ -457,6 +460,7 @@
       </w:tr>
       <w:tr>
         <w:trPr>
+          <w:cantSplit/>
           <w:tblHeader w:val="off"/>
         </w:trPr>
         <w:tc>
@@ -506,6 +510,7 @@
       </w:tr>
       <w:tr>
         <w:trPr>
+          <w:cantSplit/>
           <w:tblHeader w:val="off"/>
         </w:trPr>
         <w:tc>
@@ -561,6 +566,7 @@
       </w:tr>
       <w:tr>
         <w:trPr>
+          <w:cantSplit/>
           <w:tblHeader w:val="off"/>
         </w:trPr>
         <w:tc>
@@ -610,6 +616,7 @@
       </w:tr>
       <w:tr>
         <w:trPr>
+          <w:cantSplit/>
           <w:tblHeader w:val="off"/>
         </w:trPr>
         <w:tc>
@@ -659,6 +666,7 @@
       </w:tr>
       <w:tr>
         <w:trPr>
+          <w:cantSplit/>
           <w:tblHeader w:val="off"/>
         </w:trPr>
         <w:tc>
@@ -709,6 +717,7 @@
     </w:tbl>
     <w:p>
       <w:pPr>
+        <w:keepNext/>
         <w:spacing w:after="40" w:before="200"/>
       </w:pPr>
       <w:r>
@@ -774,6 +783,7 @@
     </w:p>
     <w:p>
       <w:pPr>
+        <w:keepNext/>
         <w:spacing w:after="40" w:before="200"/>
       </w:pPr>
       <w:r>
@@ -860,6 +870,7 @@
       </w:tblGrid>
       <w:tr>
         <w:trPr>
+          <w:cantSplit/>
           <w:tblHeader/>
         </w:trPr>
         <w:tc>
@@ -949,6 +960,7 @@
       </w:tr>
       <w:tr>
         <w:trPr>
+          <w:cantSplit/>
           <w:tblHeader w:val="off"/>
         </w:trPr>
         <w:tc>
@@ -1026,6 +1038,7 @@
       </w:tr>
       <w:tr>
         <w:trPr>
+          <w:cantSplit/>
           <w:tblHeader w:val="off"/>
         </w:trPr>
         <w:tc>
@@ -1103,6 +1116,7 @@
       </w:tr>
       <w:tr>
         <w:trPr>
+          <w:cantSplit/>
           <w:tblHeader w:val="off"/>
         </w:trPr>
         <w:tc>
@@ -1211,6 +1225,7 @@
       </w:tblGrid>
       <w:tr>
         <w:trPr>
+          <w:cantSplit/>
           <w:tblHeader/>
         </w:trPr>
         <w:tc>
@@ -1300,6 +1315,7 @@
       </w:tr>
       <w:tr>
         <w:trPr>
+          <w:cantSplit/>
           <w:tblHeader w:val="off"/>
         </w:trPr>
         <w:tc>
@@ -1371,6 +1387,7 @@
       </w:tr>
       <w:tr>
         <w:trPr>
+          <w:cantSplit/>
           <w:tblHeader w:val="off"/>
         </w:trPr>
         <w:tc>
@@ -1442,6 +1459,7 @@
       </w:tr>
       <w:tr>
         <w:trPr>
+          <w:cantSplit/>
           <w:tblHeader w:val="off"/>
         </w:trPr>
         <w:tc>
@@ -1513,6 +1531,7 @@
       </w:tr>
       <w:tr>
         <w:trPr>
+          <w:cantSplit/>
           <w:tblHeader w:val="off"/>
         </w:trPr>
         <w:tc>
@@ -1723,6 +1742,7 @@
       </w:tblGrid>
       <w:tr>
         <w:trPr>
+          <w:cantSplit/>
           <w:tblHeader/>
         </w:trPr>
         <w:tc>
@@ -1812,6 +1832,7 @@
       </w:tr>
       <w:tr>
         <w:trPr>
+          <w:cantSplit/>
           <w:tblHeader w:val="off"/>
         </w:trPr>
         <w:tc>
@@ -1887,6 +1908,7 @@
       </w:tr>
       <w:tr>
         <w:trPr>
+          <w:cantSplit/>
           <w:tblHeader w:val="off"/>
         </w:trPr>
         <w:tc>
@@ -1962,6 +1984,7 @@
       </w:tr>
       <w:tr>
         <w:trPr>
+          <w:cantSplit/>
           <w:tblHeader w:val="off"/>
         </w:trPr>
         <w:tc>
@@ -2033,6 +2056,7 @@
       </w:tr>
       <w:tr>
         <w:trPr>
+          <w:cantSplit/>
           <w:tblHeader w:val="off"/>
         </w:trPr>
         <w:tc>
@@ -2114,6 +2138,7 @@
       </w:tr>
       <w:tr>
         <w:trPr>
+          <w:cantSplit/>
           <w:tblHeader w:val="off"/>
         </w:trPr>
         <w:tc>
@@ -2191,6 +2216,7 @@
     </w:p>
     <w:p>
       <w:pPr>
+        <w:keepNext/>
         <w:spacing w:after="40" w:before="200"/>
       </w:pPr>
       <w:r>
@@ -2266,6 +2292,7 @@
     </w:p>
     <w:p>
       <w:pPr>
+        <w:keepNext/>
         <w:spacing w:after="40" w:before="200"/>
       </w:pPr>
       <w:r>
@@ -2620,10 +2647,10 @@
           <w:b/>
           <w:bCs/>
         </w:rPr>
-        <w:t xml:space="preserve">`/llms.txt`</w:t>
-      </w:r>
-      <w:r>
-        <w:t xml:space="preserve">: NEPRA is missing. Add the line below under services, and update the Cyber Security line.</w:t>
+        <w:t xml:space="preserve">/llms.txt:</w:t>
+      </w:r>
+      <w:r>
+        <w:t xml:space="preserve"> NEPRA is missing. Add the line below under services, and update the Cyber Security line.</w:t>
       </w:r>
     </w:p>
     <w:p>
@@ -3147,6 +3174,7 @@
     <w:next w:val="Normal"/>
     <w:qFormat/>
     <w:pPr>
+      <w:keepNext/>
       <w:pBdr>
         <w:bottom w:val="single" w:color="1E5BFF" w:sz="6" w:space="4"/>
       </w:pBdr>
@@ -3168,6 +3196,7 @@
     <w:next w:val="Normal"/>
     <w:qFormat/>
     <w:pPr>
+      <w:keepNext/>
       <w:spacing w:after="100" w:before="240"/>
       <w:outlineLvl w:val="1"/>
     </w:pPr>
@@ -3186,6 +3215,7 @@
     <w:next w:val="Normal"/>
     <w:qFormat/>
     <w:pPr>
+      <w:keepNext/>
       <w:spacing w:after="80" w:before="200"/>
       <w:outlineLvl w:val="2"/>
     </w:pPr>

</xml_diff>